<commit_message>
Update all docs for auto-assignment, ratings and live Lab 1
- README: Lab 1 verified live on AWS; roles table now describes
  auto-assignment, claiming when everyone is free, Away status and ratings.
- data_flow, lab_guides, architecture, aws_deployment and the
  requirements checklist: auto-assignment flow, Lab 1 status.
- Demo Script (Word): AWS-first setup, auto-assigned ticket instead of
  the claim step, star rating, Auto-Assignment page, 144 tests, new
  viva answers (auto-assignment, Away, CSAT, IAM).
- User & Demo Guide (Word): same updates, new table rows for the new
  features and tables, Lab 1 marked done.

Co-Authored-By: Claude Opus 5.5 <noreply@anthropic.com>
</commit_message>
<xml_diff>
--- a/docs/CloudOps360_Demo_Script.docx
+++ b/docs/CloudOps360_Demo_Script.docx
@@ -55,7 +55,52 @@
           <w:rFonts w:ascii="Calibri" w:hAnsi="Calibri"/>
           <w:sz w:val="22"/>
         </w:rPr>
-        <w:t xml:space="preserve"> (what to speak). Say it in your own words. Total time: about 15 minutes. Demo files are in the folder CloudOps-360\demo_files.</w:t>
+        <w:t xml:space="preserve"> (what to speak). Say it in your own words. Total time: about 15 minutes. Demo files are in the folder CloudOps-360\demo_files. Updated 24 Oct 2026: tickets are now </w:t>
+      </w:r>
+      <w:r>
+        <w:rPr>
+          <w:rFonts w:ascii="Calibri" w:hAnsi="Calibri"/>
+          <w:sz w:val="22"/>
+          <w:b/>
+        </w:rPr>
+        <w:t xml:space="preserve">assigned automatically</w:t>
+      </w:r>
+      <w:r>
+        <w:rPr>
+          <w:rFonts w:ascii="Calibri" w:hAnsi="Calibri"/>
+          <w:sz w:val="22"/>
+        </w:rPr>
+        <w:t xml:space="preserve">, technicians can be </w:t>
+      </w:r>
+      <w:r>
+        <w:rPr>
+          <w:rFonts w:ascii="Calibri" w:hAnsi="Calibri"/>
+          <w:sz w:val="22"/>
+          <w:b/>
+        </w:rPr>
+        <w:t xml:space="preserve">Away</w:t>
+      </w:r>
+      <w:r>
+        <w:rPr>
+          <w:rFonts w:ascii="Calibri" w:hAnsi="Calibri"/>
+          <w:sz w:val="22"/>
+        </w:rPr>
+        <w:t xml:space="preserve">, and employees </w:t>
+      </w:r>
+      <w:r>
+        <w:rPr>
+          <w:rFonts w:ascii="Calibri" w:hAnsi="Calibri"/>
+          <w:sz w:val="22"/>
+          <w:b/>
+        </w:rPr>
+        <w:t xml:space="preserve">rate</w:t>
+      </w:r>
+      <w:r>
+        <w:rPr>
+          <w:rFonts w:ascii="Calibri" w:hAnsi="Calibri"/>
+          <w:sz w:val="22"/>
+        </w:rPr>
+        <w:t xml:space="preserve"> the support.</w:t>
       </w:r>
     </w:p>
     <w:p>
@@ -73,7 +118,7 @@
           <w:color w:val="0F172A"/>
           <w:sz w:val="30"/>
         </w:rPr>
-        <w:t xml:space="preserve">0. Before ma'am comes (10 minutes early)</w:t>
+        <w:t xml:space="preserve">0. Before ma'am comes</w:t>
       </w:r>
     </w:p>
     <w:p>
@@ -88,7 +133,7 @@
           <w:color w:val="0E7490"/>
           <w:sz w:val="25"/>
         </w:rPr>
-        <w:t xml:space="preserve">Option A — on your laptop (best, uses real MySQL)</w:t>
+        <w:t xml:space="preserve">Option A — on AWS (the real demo, start 20 minutes early)</w:t>
       </w:r>
     </w:p>
     <w:p>
@@ -101,7 +146,153 @@
           <w:rFonts w:ascii="Calibri" w:hAnsi="Calibri"/>
           <w:sz w:val="22"/>
         </w:rPr>
-        <w:t xml:space="preserve">1.  Open PowerShell and go to the project folder:</w:t>
+        <w:t xml:space="preserve">1.  AWS Academy → Sandbox environment → </w:t>
+      </w:r>
+      <w:r>
+        <w:rPr>
+          <w:rFonts w:ascii="Calibri" w:hAnsi="Calibri"/>
+          <w:sz w:val="22"/>
+          <w:b/>
+        </w:rPr>
+        <w:t xml:space="preserve">Start Lab</w:t>
+      </w:r>
+      <w:r>
+        <w:rPr>
+          <w:rFonts w:ascii="Calibri" w:hAnsi="Calibri"/>
+          <w:sz w:val="22"/>
+        </w:rPr>
+        <w:t xml:space="preserve"> → wait for the green dot → click </w:t>
+      </w:r>
+      <w:r>
+        <w:rPr>
+          <w:rFonts w:ascii="Calibri" w:hAnsi="Calibri"/>
+          <w:sz w:val="22"/>
+          <w:b/>
+        </w:rPr>
+        <w:t xml:space="preserve">AWS</w:t>
+      </w:r>
+      <w:r>
+        <w:rPr>
+          <w:rFonts w:ascii="Calibri" w:hAnsi="Calibri"/>
+          <w:sz w:val="22"/>
+        </w:rPr>
+        <w:t xml:space="preserve">.</w:t>
+      </w:r>
+    </w:p>
+    <w:p>
+      <w:pPr>
+        <w:ind w:left="540" w:hanging="300"/>
+        <w:spacing w:after="40"/>
+      </w:pPr>
+      <w:r>
+        <w:rPr>
+          <w:rFonts w:ascii="Calibri" w:hAnsi="Calibri"/>
+          <w:sz w:val="22"/>
+        </w:rPr>
+        <w:t xml:space="preserve">2.  Region N. Virginia → </w:t>
+      </w:r>
+      <w:r>
+        <w:rPr>
+          <w:rFonts w:ascii="Calibri" w:hAnsi="Calibri"/>
+          <w:sz w:val="22"/>
+          <w:b/>
+        </w:rPr>
+        <w:t xml:space="preserve">EC2</w:t>
+      </w:r>
+      <w:r>
+        <w:rPr>
+          <w:rFonts w:ascii="Calibri" w:hAnsi="Calibri"/>
+          <w:sz w:val="22"/>
+        </w:rPr>
+        <w:t xml:space="preserve"> → </w:t>
+      </w:r>
+      <w:r>
+        <w:rPr>
+          <w:rFonts w:ascii="Calibri" w:hAnsi="Calibri"/>
+          <w:sz w:val="22"/>
+          <w:b/>
+        </w:rPr>
+        <w:t xml:space="preserve">Launch instance</w:t>
+      </w:r>
+      <w:r>
+        <w:rPr>
+          <w:rFonts w:ascii="Calibri" w:hAnsi="Calibri"/>
+          <w:sz w:val="22"/>
+        </w:rPr>
+        <w:t xml:space="preserve">: name cloudops360-web, </w:t>
+      </w:r>
+      <w:r>
+        <w:rPr>
+          <w:rFonts w:ascii="Calibri" w:hAnsi="Calibri"/>
+          <w:sz w:val="22"/>
+          <w:b/>
+        </w:rPr>
+        <w:t xml:space="preserve">Amazon Linux 2023</w:t>
+      </w:r>
+      <w:r>
+        <w:rPr>
+          <w:rFonts w:ascii="Calibri" w:hAnsi="Calibri"/>
+          <w:sz w:val="22"/>
+        </w:rPr>
+        <w:t xml:space="preserve">, </w:t>
+      </w:r>
+      <w:r>
+        <w:rPr>
+          <w:rFonts w:ascii="Calibri" w:hAnsi="Calibri"/>
+          <w:sz w:val="22"/>
+          <w:b/>
+        </w:rPr>
+        <w:t xml:space="preserve">t3.micro</w:t>
+      </w:r>
+      <w:r>
+        <w:rPr>
+          <w:rFonts w:ascii="Calibri" w:hAnsi="Calibri"/>
+          <w:sz w:val="22"/>
+        </w:rPr>
+        <w:t xml:space="preserve">, key pair </w:t>
+      </w:r>
+      <w:r>
+        <w:rPr>
+          <w:rFonts w:ascii="Calibri" w:hAnsi="Calibri"/>
+          <w:sz w:val="22"/>
+          <w:b/>
+        </w:rPr>
+        <w:t xml:space="preserve">vockey</w:t>
+      </w:r>
+      <w:r>
+        <w:rPr>
+          <w:rFonts w:ascii="Calibri" w:hAnsi="Calibri"/>
+          <w:sz w:val="22"/>
+        </w:rPr>
+        <w:t xml:space="preserve">, tick SSH, HTTPS and HTTP.</w:t>
+      </w:r>
+    </w:p>
+    <w:p>
+      <w:pPr>
+        <w:ind w:left="540" w:hanging="300"/>
+        <w:spacing w:after="40"/>
+      </w:pPr>
+      <w:r>
+        <w:rPr>
+          <w:rFonts w:ascii="Calibri" w:hAnsi="Calibri"/>
+          <w:sz w:val="22"/>
+        </w:rPr>
+        <w:t xml:space="preserve">3.  </w:t>
+      </w:r>
+      <w:r>
+        <w:rPr>
+          <w:rFonts w:ascii="Calibri" w:hAnsi="Calibri"/>
+          <w:sz w:val="22"/>
+          <w:b/>
+        </w:rPr>
+        <w:t xml:space="preserve">Advanced details → User data</w:t>
+      </w:r>
+      <w:r>
+        <w:rPr>
+          <w:rFonts w:ascii="Calibri" w:hAnsi="Calibri"/>
+          <w:sz w:val="22"/>
+        </w:rPr>
+        <w:t xml:space="preserve"> (last box) → paste these 2 lines exactly (right-click → Paste):</w:t>
       </w:r>
     </w:p>
     <w:p>
@@ -115,7 +306,21 @@
           <w:rFonts w:ascii="Consolas" w:hAnsi="Consolas"/>
           <w:sz w:val="20"/>
         </w:rPr>
-        <w:t xml:space="preserve">cd C:\Users\Gabriel\OneDrive\Desktop\CloudOps-360</w:t>
+        <w:t xml:space="preserve">#!/bin/bash</w:t>
+      </w:r>
+    </w:p>
+    <w:p>
+      <w:pPr>
+        <w:shd w:val="clear" w:color="auto" w:fill="EEF2F6"/>
+        <w:ind w:left="360"/>
+        <w:spacing w:after="60"/>
+      </w:pPr>
+      <w:r>
+        <w:rPr>
+          <w:rFonts w:ascii="Consolas" w:hAnsi="Consolas"/>
+          <w:sz w:val="20"/>
+        </w:rPr>
+        <w:t xml:space="preserve">curl -fsSL https://raw.githubusercontent.com/Gabriel2006galaxy/CloudOps-360/main/infrastructure/aws/user_data_demo.sh | bash</w:t>
       </w:r>
     </w:p>
     <w:p>
@@ -128,7 +333,122 @@
           <w:rFonts w:ascii="Calibri" w:hAnsi="Calibri"/>
           <w:sz w:val="22"/>
         </w:rPr>
-        <w:t xml:space="preserve">1.  Start the website (keep this window open):</w:t>
+        <w:t xml:space="preserve">4.  </w:t>
+      </w:r>
+      <w:r>
+        <w:rPr>
+          <w:rFonts w:ascii="Calibri" w:hAnsi="Calibri"/>
+          <w:sz w:val="22"/>
+          <w:b/>
+        </w:rPr>
+        <w:t xml:space="preserve">Launch</w:t>
+      </w:r>
+      <w:r>
+        <w:rPr>
+          <w:rFonts w:ascii="Calibri" w:hAnsi="Calibri"/>
+          <w:sz w:val="22"/>
+        </w:rPr>
+        <w:t xml:space="preserve"> → View all instances → copy the </w:t>
+      </w:r>
+      <w:r>
+        <w:rPr>
+          <w:rFonts w:ascii="Calibri" w:hAnsi="Calibri"/>
+          <w:sz w:val="22"/>
+          <w:b/>
+        </w:rPr>
+        <w:t xml:space="preserve">Public IPv4</w:t>
+      </w:r>
+      <w:r>
+        <w:rPr>
+          <w:rFonts w:ascii="Calibri" w:hAnsi="Calibri"/>
+          <w:sz w:val="22"/>
+        </w:rPr>
+        <w:t xml:space="preserve">. Wait about </w:t>
+      </w:r>
+      <w:r>
+        <w:rPr>
+          <w:rFonts w:ascii="Calibri" w:hAnsi="Calibri"/>
+          <w:sz w:val="22"/>
+          <w:b/>
+        </w:rPr>
+        <w:t xml:space="preserve">10 minutes</w:t>
+      </w:r>
+      <w:r>
+        <w:rPr>
+          <w:rFonts w:ascii="Calibri" w:hAnsi="Calibri"/>
+          <w:sz w:val="22"/>
+        </w:rPr>
+        <w:t xml:space="preserve">, then open </w:t>
+      </w:r>
+      <w:r>
+        <w:rPr>
+          <w:rFonts w:ascii="Calibri" w:hAnsi="Calibri"/>
+          <w:sz w:val="22"/>
+          <w:b/>
+        </w:rPr>
+        <w:t xml:space="preserve">http://&lt;IP&gt;</w:t>
+      </w:r>
+      <w:r>
+        <w:rPr>
+          <w:rFonts w:ascii="Calibri" w:hAnsi="Calibri"/>
+          <w:sz w:val="22"/>
+        </w:rPr>
+        <w:t xml:space="preserve"> (http, not https).</w:t>
+      </w:r>
+    </w:p>
+    <w:p>
+      <w:pPr>
+        <w:spacing w:after="100"/>
+      </w:pPr>
+      <w:r>
+        <w:rPr>
+          <w:rFonts w:ascii="Calibri" w:hAnsi="Calibri"/>
+          <w:sz w:val="22"/>
+        </w:rPr>
+        <w:t xml:space="preserve">Below, </w:t>
+      </w:r>
+      <w:r>
+        <w:rPr>
+          <w:rFonts w:ascii="Calibri" w:hAnsi="Calibri"/>
+          <w:sz w:val="22"/>
+          <w:b/>
+        </w:rPr>
+        <w:t xml:space="preserve">&lt;IP&gt;</w:t>
+      </w:r>
+      <w:r>
+        <w:rPr>
+          <w:rFonts w:ascii="Calibri" w:hAnsi="Calibri"/>
+          <w:sz w:val="22"/>
+        </w:rPr>
+        <w:t xml:space="preserve"> means this public IP address.</w:t>
+      </w:r>
+    </w:p>
+    <w:p>
+      <w:pPr>
+        <w:keepNext/>
+        <w:spacing w:before="180" w:after="60"/>
+      </w:pPr>
+      <w:r>
+        <w:rPr>
+          <w:rFonts w:ascii="Calibri" w:hAnsi="Calibri"/>
+          <w:b/>
+          <w:color w:val="0E7490"/>
+          <w:sz w:val="25"/>
+        </w:rPr>
+        <w:t xml:space="preserve">Option B — on your laptop (backup)</w:t>
+      </w:r>
+    </w:p>
+    <w:p>
+      <w:pPr>
+        <w:ind w:left="540" w:hanging="300"/>
+        <w:spacing w:after="40"/>
+      </w:pPr>
+      <w:r>
+        <w:rPr>
+          <w:rFonts w:ascii="Calibri" w:hAnsi="Calibri"/>
+          <w:sz w:val="22"/>
+        </w:rPr>
+        <w:t xml:space="preserve">1.  Open PowerShell and go to the project folder:</w:t>
       </w:r>
     </w:p>
     <w:p>
@@ -142,7 +462,7 @@
           <w:rFonts w:ascii="Consolas" w:hAnsi="Consolas"/>
           <w:sz w:val="20"/>
         </w:rPr>
-        <w:t xml:space="preserve">.venv\Scripts\python run.py</w:t>
+        <w:t xml:space="preserve">cd C:\Users\Gabriel\OneDrive\Desktop\CloudOps-360</w:t>
       </w:r>
     </w:p>
     <w:p>
@@ -155,7 +475,34 @@
           <w:rFonts w:ascii="Calibri" w:hAnsi="Calibri"/>
           <w:sz w:val="22"/>
         </w:rPr>
-        <w:t xml:space="preserve">1.  Open http://127.0.0.1:5000 in the browser.</w:t>
+        <w:t xml:space="preserve">2.  Start the website (keep this window open):</w:t>
+      </w:r>
+    </w:p>
+    <w:p>
+      <w:pPr>
+        <w:shd w:val="clear" w:color="auto" w:fill="EEF2F6"/>
+        <w:ind w:left="360"/>
+        <w:spacing w:after="60"/>
+      </w:pPr>
+      <w:r>
+        <w:rPr>
+          <w:rFonts w:ascii="Consolas" w:hAnsi="Consolas"/>
+          <w:sz w:val="20"/>
+        </w:rPr>
+        <w:t xml:space="preserve">.venv\Scripts\python run.py</w:t>
+      </w:r>
+    </w:p>
+    <w:p>
+      <w:pPr>
+        <w:ind w:left="540" w:hanging="300"/>
+        <w:spacing w:after="40"/>
+      </w:pPr>
+      <w:r>
+        <w:rPr>
+          <w:rFonts w:ascii="Calibri" w:hAnsi="Calibri"/>
+          <w:sz w:val="22"/>
+        </w:rPr>
+        <w:t xml:space="preserve">3.  Open http://127.0.0.1:5000 in the browser (then &lt;IP&gt; = 127.0.0.1:5000).</w:t>
       </w:r>
     </w:p>
     <w:p>
@@ -183,61 +530,6 @@
           <w:color w:val="0E7490"/>
           <w:sz w:val="25"/>
         </w:rPr>
-        <w:t xml:space="preserve">Option B — GitHub Codespaces (SQLite demo data)</w:t>
-      </w:r>
-    </w:p>
-    <w:p>
-      <w:pPr>
-        <w:ind w:left="540" w:hanging="300"/>
-        <w:spacing w:after="40"/>
-      </w:pPr>
-      <w:r>
-        <w:rPr>
-          <w:rFonts w:ascii="Calibri" w:hAnsi="Calibri"/>
-          <w:sz w:val="22"/>
-        </w:rPr>
-        <w:t xml:space="preserve">1.  Open the Codespace, in its terminal run:  python run.py</w:t>
-      </w:r>
-    </w:p>
-    <w:p>
-      <w:pPr>
-        <w:ind w:left="540" w:hanging="300"/>
-        <w:spacing w:after="40"/>
-      </w:pPr>
-      <w:r>
-        <w:rPr>
-          <w:rFonts w:ascii="Calibri" w:hAnsi="Calibri"/>
-          <w:sz w:val="22"/>
-        </w:rPr>
-        <w:t xml:space="preserve">2.  Ports tab → port 5000 → Open in Browser. Your address is:</w:t>
-      </w:r>
-    </w:p>
-    <w:p>
-      <w:pPr>
-        <w:shd w:val="clear" w:color="auto" w:fill="EEF2F6"/>
-        <w:ind w:left="360"/>
-        <w:spacing w:after="60"/>
-      </w:pPr>
-      <w:r>
-        <w:rPr>
-          <w:rFonts w:ascii="Consolas" w:hAnsi="Consolas"/>
-          <w:sz w:val="20"/>
-        </w:rPr>
-        <w:t xml:space="preserve">https://fluffy-system-7v45rg6wvv6gfpw5v-5000.app.github.dev</w:t>
-      </w:r>
-    </w:p>
-    <w:p>
-      <w:pPr>
-        <w:keepNext/>
-        <w:spacing w:before="180" w:after="60"/>
-      </w:pPr>
-      <w:r>
-        <w:rPr>
-          <w:rFonts w:ascii="Calibri" w:hAnsi="Calibri"/>
-          <w:b/>
-          <w:color w:val="0E7490"/>
-          <w:sz w:val="25"/>
-        </w:rPr>
         <w:t xml:space="preserve">Accounts</w:t>
       </w:r>
     </w:p>
@@ -287,7 +579,7 @@
           <w:rFonts w:ascii="Calibri" w:hAnsi="Calibri"/>
           <w:sz w:val="22"/>
         </w:rPr>
-        <w:t xml:space="preserve">•  Technician: </w:t>
+        <w:t xml:space="preserve">•  Technicians: </w:t>
       </w:r>
       <w:r>
         <w:rPr>
@@ -296,6 +588,21 @@
           <w:b/>
         </w:rPr>
         <w:t xml:space="preserve">tech_sarah</w:t>
+      </w:r>
+      <w:r>
+        <w:rPr>
+          <w:rFonts w:ascii="Calibri" w:hAnsi="Calibri"/>
+          <w:sz w:val="22"/>
+        </w:rPr>
+        <w:t xml:space="preserve"> and </w:t>
+      </w:r>
+      <w:r>
+        <w:rPr>
+          <w:rFonts w:ascii="Calibri" w:hAnsi="Calibri"/>
+          <w:sz w:val="22"/>
+          <w:b/>
+        </w:rPr>
+        <w:t xml:space="preserve">tech_marcus</w:t>
       </w:r>
       <w:r>
         <w:rPr>
@@ -512,7 +819,7 @@
           <w:i/>
           <w:sz w:val="22"/>
         </w:rPr>
-        <w:t xml:space="preserve">Ma'am, my project is CloudOps 360, an IT helpdesk system. When something breaks, like email or VPN, an employee reports it here, a support technician fixes it, and an administrator monitors everything. It has three roles: employee, technician and admin. Every problem is a ticket with its own number and goes through five stages: Open, Assigned, In Progress, Resolved and Closed. Every ticket has a deadline called SLA, and every important action is recorded in an audit log. It is built with Python Flask, MySQL, Bootstrap and Chart.js, and designed to run on AWS EC2, RDS and EFS, which we will do in the three labs.</w:t>
+        <w:t xml:space="preserve">Ma'am, my project is CloudOps 360, an IT helpdesk system. When something breaks, like email or VPN, an employee reports it here, the system automatically gives it to the right support technician, the technician fixes it, and the employee rates the support. An administrator monitors everything. It has three roles: employee, technician and admin. Every problem is a ticket with its own number and goes through five stages: Open, Assigned, In Progress, Resolved and Closed. Every ticket has a deadline called SLA, and every important action is recorded in an audit log. It is built with Python Flask, MySQL, Bootstrap and Chart.js, and it is running live on an AWS EC2 server.</w:t>
       </w:r>
     </w:p>
     <w:p>
@@ -718,6 +1025,96 @@
     <w:p>
       <w:pPr>
         <w:ind w:left="360"/>
+        <w:spacing w:after="60"/>
+      </w:pPr>
+      <w:r>
+        <w:rPr>
+          <w:rFonts w:ascii="Calibri" w:hAnsi="Calibri"/>
+          <w:color w:val="0E7490"/>
+          <w:sz w:val="22"/>
+          <w:b/>
+        </w:rPr>
+        <w:t xml:space="preserve">DO:</w:t>
+      </w:r>
+      <w:r>
+        <w:rPr>
+          <w:rFonts w:ascii="Calibri" w:hAnsi="Calibri"/>
+          <w:color w:val="0E7490"/>
+          <w:sz w:val="22"/>
+        </w:rPr>
+        <w:t xml:space="preserve">  </w:t>
+      </w:r>
+      <w:r>
+        <w:rPr>
+          <w:rFonts w:ascii="Calibri" w:hAnsi="Calibri"/>
+          <w:sz w:val="22"/>
+        </w:rPr>
+        <w:t xml:space="preserve">Point at the green message "</w:t>
+      </w:r>
+      <w:r>
+        <w:rPr>
+          <w:rFonts w:ascii="Calibri" w:hAnsi="Calibri"/>
+          <w:sz w:val="22"/>
+          <w:b/>
+        </w:rPr>
+        <w:t xml:space="preserve">created and automatically assigned to Sarah Connor</w:t>
+      </w:r>
+      <w:r>
+        <w:rPr>
+          <w:rFonts w:ascii="Calibri" w:hAnsi="Calibri"/>
+          <w:sz w:val="22"/>
+        </w:rPr>
+        <w:t xml:space="preserve">", the status </w:t>
+      </w:r>
+      <w:r>
+        <w:rPr>
+          <w:rFonts w:ascii="Calibri" w:hAnsi="Calibri"/>
+          <w:sz w:val="22"/>
+          <w:b/>
+        </w:rPr>
+        <w:t xml:space="preserve">Assigned</w:t>
+      </w:r>
+      <w:r>
+        <w:rPr>
+          <w:rFonts w:ascii="Calibri" w:hAnsi="Calibri"/>
+          <w:sz w:val="22"/>
+        </w:rPr>
+        <w:t xml:space="preserve">, and on the right the </w:t>
+      </w:r>
+      <w:r>
+        <w:rPr>
+          <w:rFonts w:ascii="Calibri" w:hAnsi="Calibri"/>
+          <w:sz w:val="22"/>
+          <w:b/>
+        </w:rPr>
+        <w:t xml:space="preserve">Activity history</w:t>
+      </w:r>
+      <w:r>
+        <w:rPr>
+          <w:rFonts w:ascii="Calibri" w:hAnsi="Calibri"/>
+          <w:sz w:val="22"/>
+        </w:rPr>
+        <w:t xml:space="preserve">: "</w:t>
+      </w:r>
+      <w:r>
+        <w:rPr>
+          <w:rFonts w:ascii="Calibri" w:hAnsi="Calibri"/>
+          <w:sz w:val="22"/>
+          <w:b/>
+        </w:rPr>
+        <w:t xml:space="preserve">System (auto-assign)</w:t>
+      </w:r>
+      <w:r>
+        <w:rPr>
+          <w:rFonts w:ascii="Calibri" w:hAnsi="Calibri"/>
+          <w:sz w:val="22"/>
+        </w:rPr>
+        <w:t xml:space="preserve">" with the reason.</w:t>
+      </w:r>
+    </w:p>
+    <w:p>
+      <w:pPr>
+        <w:ind w:left="360"/>
         <w:shd w:val="clear" w:color="auto" w:fill="FFF7E6"/>
         <w:spacing w:after="120"/>
       </w:pPr>
@@ -744,7 +1141,7 @@
           <w:i/>
           <w:sz w:val="22"/>
         </w:rPr>
-        <w:t xml:space="preserve">The ticket got a unique number like INC-2026-00013 and status Open. Because the priority is High, the system automatically set a 12-hour deadline — see the countdown in SLA tracking. The screenshot is checked, stored under a random name, and its details are saved in the database.</w:t>
+        <w:t xml:space="preserve">The ticket got a unique number and was assigned automatically. The system only looks at technicians who are available and not overloaded, prefers the specialist for this category — Sarah — and picks the lightest workload. Every technician also got a notification. Because the priority is High, the system set a 12-hour deadline — see the countdown in SLA tracking. The screenshot is checked, stored under a random name, and its details are saved in the database.</w:t>
       </w:r>
     </w:p>
     <w:p>
@@ -804,22 +1201,7 @@
           <w:rFonts w:ascii="Calibri" w:hAnsi="Calibri"/>
           <w:sz w:val="22"/>
         </w:rPr>
-        <w:t xml:space="preserve">. If you use the same tab, click the address bar, press </w:t>
-      </w:r>
-      <w:r>
-        <w:rPr>
-          <w:rFonts w:ascii="Calibri" w:hAnsi="Calibri"/>
-          <w:sz w:val="22"/>
-          <w:b/>
-        </w:rPr>
-        <w:t xml:space="preserve">Ctrl + A</w:t>
-      </w:r>
-      <w:r>
-        <w:rPr>
-          <w:rFonts w:ascii="Calibri" w:hAnsi="Calibri"/>
-          <w:sz w:val="22"/>
-        </w:rPr>
-        <w:t xml:space="preserve"> first so the old address is highlighted, then paste.</w:t>
+        <w:t xml:space="preserve">.</w:t>
       </w:r>
     </w:p>
     <w:p>
@@ -863,7 +1245,96 @@
           <w:rFonts w:ascii="Consolas" w:hAnsi="Consolas"/>
           <w:sz w:val="20"/>
         </w:rPr>
-        <w:t xml:space="preserve">Laptop:      127.0.0.1:5000/tickets/INC-2026-00002</w:t>
+        <w:t xml:space="preserve">&lt;IP&gt;/tickets/INC-2026-00002</w:t>
+      </w:r>
+    </w:p>
+    <w:p>
+      <w:pPr>
+        <w:spacing w:after="100"/>
+      </w:pPr>
+      <w:r>
+        <w:rPr>
+          <w:rFonts w:ascii="Calibri" w:hAnsi="Calibri"/>
+          <w:sz w:val="22"/>
+        </w:rPr>
+        <w:t xml:space="preserve">Result: </w:t>
+      </w:r>
+      <w:r>
+        <w:rPr>
+          <w:rFonts w:ascii="Calibri" w:hAnsi="Calibri"/>
+          <w:sz w:val="22"/>
+          <w:b/>
+        </w:rPr>
+        <w:t xml:space="preserve">ERROR 403 — Access Denied</w:t>
+      </w:r>
+      <w:r>
+        <w:rPr>
+          <w:rFonts w:ascii="Calibri" w:hAnsi="Calibri"/>
+          <w:sz w:val="22"/>
+        </w:rPr>
+        <w:t xml:space="preserve">, "This access attempt has been recorded in the audit log."</w:t>
+      </w:r>
+    </w:p>
+    <w:p>
+      <w:pPr>
+        <w:ind w:left="360"/>
+        <w:shd w:val="clear" w:color="auto" w:fill="FFF7E6"/>
+        <w:spacing w:after="120"/>
+      </w:pPr>
+      <w:r>
+        <w:rPr>
+          <w:rFonts w:ascii="Calibri" w:hAnsi="Calibri"/>
+          <w:color w:val="B45309"/>
+          <w:sz w:val="22"/>
+          <w:b/>
+        </w:rPr>
+        <w:t xml:space="preserve">SAY:</w:t>
+      </w:r>
+      <w:r>
+        <w:rPr>
+          <w:rFonts w:ascii="Calibri" w:hAnsi="Calibri"/>
+          <w:color w:val="B45309"/>
+          <w:sz w:val="22"/>
+        </w:rPr>
+        <w:t xml:space="preserve">  </w:t>
+      </w:r>
+      <w:r>
+        <w:rPr>
+          <w:rFonts w:ascii="Calibri" w:hAnsi="Calibri"/>
+          <w:i/>
+          <w:sz w:val="22"/>
+        </w:rPr>
+        <w:t xml:space="preserve">Ticket 00002 belongs to Elena. Even if Jordan types the link directly, the server checks his permission and blocks it, and the attempt is recorded in the audit log.</w:t>
+      </w:r>
+    </w:p>
+    <w:p>
+      <w:pPr>
+        <w:ind w:left="360"/>
+        <w:spacing w:after="60"/>
+      </w:pPr>
+      <w:r>
+        <w:rPr>
+          <w:rFonts w:ascii="Calibri" w:hAnsi="Calibri"/>
+          <w:color w:val="0E7490"/>
+          <w:sz w:val="22"/>
+          <w:b/>
+        </w:rPr>
+        <w:t xml:space="preserve">DO:</w:t>
+      </w:r>
+      <w:r>
+        <w:rPr>
+          <w:rFonts w:ascii="Calibri" w:hAnsi="Calibri"/>
+          <w:color w:val="0E7490"/>
+          <w:sz w:val="22"/>
+        </w:rPr>
+        <w:t xml:space="preserve">  </w:t>
+      </w:r>
+      <w:r>
+        <w:rPr>
+          <w:rFonts w:ascii="Calibri" w:hAnsi="Calibri"/>
+          <w:sz w:val="22"/>
+        </w:rPr>
+        <w:t xml:space="preserve">Open the admin page the same way:</w:t>
       </w:r>
     </w:p>
     <w:p>
@@ -877,124 +1348,7 @@
           <w:rFonts w:ascii="Consolas" w:hAnsi="Consolas"/>
           <w:sz w:val="20"/>
         </w:rPr>
-        <w:t xml:space="preserve">Codespaces:  https://fluffy-system-7v45rg6wvv6gfpw5v-5000.app.github.dev/tickets/INC-2026-00002</w:t>
-      </w:r>
-    </w:p>
-    <w:p>
-      <w:pPr>
-        <w:spacing w:after="100"/>
-      </w:pPr>
-      <w:r>
-        <w:rPr>
-          <w:rFonts w:ascii="Calibri" w:hAnsi="Calibri"/>
-          <w:sz w:val="22"/>
-        </w:rPr>
-        <w:t xml:space="preserve">Result: </w:t>
-      </w:r>
-      <w:r>
-        <w:rPr>
-          <w:rFonts w:ascii="Calibri" w:hAnsi="Calibri"/>
-          <w:sz w:val="22"/>
-          <w:b/>
-        </w:rPr>
-        <w:t xml:space="preserve">ERROR 403 — Access Denied</w:t>
-      </w:r>
-      <w:r>
-        <w:rPr>
-          <w:rFonts w:ascii="Calibri" w:hAnsi="Calibri"/>
-          <w:sz w:val="22"/>
-        </w:rPr>
-        <w:t xml:space="preserve">, "This access attempt has been recorded in the audit log."</w:t>
-      </w:r>
-    </w:p>
-    <w:p>
-      <w:pPr>
-        <w:ind w:left="360"/>
-        <w:shd w:val="clear" w:color="auto" w:fill="FFF7E6"/>
-        <w:spacing w:after="120"/>
-      </w:pPr>
-      <w:r>
-        <w:rPr>
-          <w:rFonts w:ascii="Calibri" w:hAnsi="Calibri"/>
-          <w:color w:val="B45309"/>
-          <w:sz w:val="22"/>
-          <w:b/>
-        </w:rPr>
-        <w:t xml:space="preserve">SAY:</w:t>
-      </w:r>
-      <w:r>
-        <w:rPr>
-          <w:rFonts w:ascii="Calibri" w:hAnsi="Calibri"/>
-          <w:color w:val="B45309"/>
-          <w:sz w:val="22"/>
-        </w:rPr>
-        <w:t xml:space="preserve">  </w:t>
-      </w:r>
-      <w:r>
-        <w:rPr>
-          <w:rFonts w:ascii="Calibri" w:hAnsi="Calibri"/>
-          <w:i/>
-          <w:sz w:val="22"/>
-        </w:rPr>
-        <w:t xml:space="preserve">Ticket 00002 belongs to Elena. Even if Jordan types the link directly, the server checks his permission and blocks it, and the attempt is recorded in the audit log.</w:t>
-      </w:r>
-    </w:p>
-    <w:p>
-      <w:pPr>
-        <w:ind w:left="360"/>
-        <w:spacing w:after="60"/>
-      </w:pPr>
-      <w:r>
-        <w:rPr>
-          <w:rFonts w:ascii="Calibri" w:hAnsi="Calibri"/>
-          <w:color w:val="0E7490"/>
-          <w:sz w:val="22"/>
-          <w:b/>
-        </w:rPr>
-        <w:t xml:space="preserve">DO:</w:t>
-      </w:r>
-      <w:r>
-        <w:rPr>
-          <w:rFonts w:ascii="Calibri" w:hAnsi="Calibri"/>
-          <w:color w:val="0E7490"/>
-          <w:sz w:val="22"/>
-        </w:rPr>
-        <w:t xml:space="preserve">  </w:t>
-      </w:r>
-      <w:r>
-        <w:rPr>
-          <w:rFonts w:ascii="Calibri" w:hAnsi="Calibri"/>
-          <w:sz w:val="22"/>
-        </w:rPr>
-        <w:t xml:space="preserve">Open the admin page the same way:</w:t>
-      </w:r>
-    </w:p>
-    <w:p>
-      <w:pPr>
-        <w:shd w:val="clear" w:color="auto" w:fill="EEF2F6"/>
-        <w:ind w:left="360"/>
-        <w:spacing w:after="60"/>
-      </w:pPr>
-      <w:r>
-        <w:rPr>
-          <w:rFonts w:ascii="Consolas" w:hAnsi="Consolas"/>
-          <w:sz w:val="20"/>
-        </w:rPr>
-        <w:t xml:space="preserve">Laptop:      127.0.0.1:5000/admin/users</w:t>
-      </w:r>
-    </w:p>
-    <w:p>
-      <w:pPr>
-        <w:shd w:val="clear" w:color="auto" w:fill="EEF2F6"/>
-        <w:ind w:left="360"/>
-        <w:spacing w:after="60"/>
-      </w:pPr>
-      <w:r>
-        <w:rPr>
-          <w:rFonts w:ascii="Consolas" w:hAnsi="Consolas"/>
-          <w:sz w:val="20"/>
-        </w:rPr>
-        <w:t xml:space="preserve">Codespaces:  https://fluffy-system-7v45rg6wvv6gfpw5v-5000.app.github.dev/admin/users</w:t>
+        <w:t xml:space="preserve">&lt;IP&gt;/admin/users</w:t>
       </w:r>
     </w:p>
     <w:p>
@@ -1059,7 +1413,7 @@
           <w:color w:val="0E7490"/>
           <w:sz w:val="25"/>
         </w:rPr>
-        <w:t xml:space="preserve">Part A — Claim</w:t>
+        <w:t xml:space="preserve">Part A — Sarah gets the ticket automatically</w:t>
       </w:r>
     </w:p>
     <w:p>
@@ -1104,7 +1458,37 @@
           <w:rFonts w:ascii="Calibri" w:hAnsi="Calibri"/>
           <w:sz w:val="22"/>
         </w:rPr>
-        <w:t xml:space="preserve">. Show the dashboard.</w:t>
+        <w:t xml:space="preserve">. Click the </w:t>
+      </w:r>
+      <w:r>
+        <w:rPr>
+          <w:rFonts w:ascii="Calibri" w:hAnsi="Calibri"/>
+          <w:sz w:val="22"/>
+          <w:b/>
+        </w:rPr>
+        <w:t xml:space="preserve">🔔 bell</w:t>
+      </w:r>
+      <w:r>
+        <w:rPr>
+          <w:rFonts w:ascii="Calibri" w:hAnsi="Calibri"/>
+          <w:sz w:val="22"/>
+        </w:rPr>
+        <w:t xml:space="preserve"> → "</w:t>
+      </w:r>
+      <w:r>
+        <w:rPr>
+          <w:rFonts w:ascii="Calibri" w:hAnsi="Calibri"/>
+          <w:sz w:val="22"/>
+          <w:b/>
+        </w:rPr>
+        <w:t xml:space="preserve">Auto-assigned: INC-2026-000..</w:t>
+      </w:r>
+      <w:r>
+        <w:rPr>
+          <w:rFonts w:ascii="Calibri" w:hAnsi="Calibri"/>
+          <w:sz w:val="22"/>
+        </w:rPr>
+        <w:t xml:space="preserve">" → open it.</w:t>
       </w:r>
     </w:p>
     <w:p>
@@ -1136,7 +1520,7 @@
           <w:i/>
           <w:sz w:val="22"/>
         </w:rPr>
-        <w:t xml:space="preserve">This is the technician dashboard: Sarah's active tickets, critical ones, overdue ones, and the unassigned queue.</w:t>
+        <w:t xml:space="preserve">Sarah did not have to look for the ticket — the system gave it to her and told her, including why it chose her. If every technician had been free, the ticket would wait in the queue and the first technician to click Claim would take it; if nobody claims it in time, the system assigns it by itself.</w:t>
       </w:r>
     </w:p>
     <w:p>
@@ -1166,7 +1550,7 @@
           <w:rFonts w:ascii="Calibri" w:hAnsi="Calibri"/>
           <w:sz w:val="22"/>
         </w:rPr>
-        <w:t xml:space="preserve">Sidebar → </w:t>
+        <w:t xml:space="preserve">(Optional) Sidebar → </w:t>
       </w:r>
       <w:r>
         <w:rPr>
@@ -1181,22 +1565,37 @@
           <w:rFonts w:ascii="Calibri" w:hAnsi="Calibri"/>
           <w:sz w:val="22"/>
         </w:rPr>
-        <w:t xml:space="preserve"> → click </w:t>
-      </w:r>
-      <w:r>
-        <w:rPr>
-          <w:rFonts w:ascii="Calibri" w:hAnsi="Calibri"/>
-          <w:sz w:val="22"/>
-          <w:b/>
-        </w:rPr>
-        <w:t xml:space="preserve">Claim</w:t>
-      </w:r>
-      <w:r>
-        <w:rPr>
-          <w:rFonts w:ascii="Calibri" w:hAnsi="Calibri"/>
-          <w:sz w:val="22"/>
-        </w:rPr>
-        <w:t xml:space="preserve"> on Jordan's ticket "Email not syncing on laptop".</w:t>
+        <w:t xml:space="preserve">: show </w:t>
+      </w:r>
+      <w:r>
+        <w:rPr>
+          <w:rFonts w:ascii="Calibri" w:hAnsi="Calibri"/>
+          <w:sz w:val="22"/>
+          <w:b/>
+        </w:rPr>
+        <w:t xml:space="preserve">My status</w:t>
+      </w:r>
+      <w:r>
+        <w:rPr>
+          <w:rFonts w:ascii="Calibri" w:hAnsi="Calibri"/>
+          <w:sz w:val="22"/>
+        </w:rPr>
+        <w:t xml:space="preserve"> (Available / Away) and </w:t>
+      </w:r>
+      <w:r>
+        <w:rPr>
+          <w:rFonts w:ascii="Calibri" w:hAnsi="Calibri"/>
+          <w:sz w:val="22"/>
+          <w:b/>
+        </w:rPr>
+        <w:t xml:space="preserve">How tickets reach you</w:t>
+      </w:r>
+      <w:r>
+        <w:rPr>
+          <w:rFonts w:ascii="Calibri" w:hAnsi="Calibri"/>
+          <w:sz w:val="22"/>
+        </w:rPr>
+        <w:t xml:space="preserve">.</w:t>
       </w:r>
     </w:p>
     <w:p>
@@ -1228,7 +1627,7 @@
           <w:i/>
           <w:sz w:val="22"/>
         </w:rPr>
-        <w:t xml:space="preserve">New tickets wait in the unassigned queue. Sarah claims it, so it is now Assigned to her and Jordan gets a notification. Technicians only see their own tickets and this queue. Sarah can also see and download Jordan's screenshot because she is the assigned technician.</w:t>
+        <w:t xml:space="preserve">If Sarah is sick she sets herself Away, with a return date. Then she gets no new tickets until she is back, and the admin is warned about her open tickets.</w:t>
       </w:r>
     </w:p>
     <w:p>
@@ -1798,7 +2197,7 @@
           <w:color w:val="0F172A"/>
           <w:sz w:val="30"/>
         </w:rPr>
-        <w:t xml:space="preserve">Step 5 — Employee confirms (2 min)</w:t>
+        <w:t xml:space="preserve">Step 5 — Employee confirms and rates (2 min)</w:t>
       </w:r>
     </w:p>
     <w:p>
@@ -1890,7 +2289,7 @@
           <w:i/>
           <w:sz w:val="22"/>
         </w:rPr>
-        <w:t xml:space="preserve">Every time something happened to his ticket, Jordan was notified automatically: the assignment, status changes, the reply and the new file. And notice — there is no notification about the internal note; Jordan is not even told it exists.</w:t>
+        <w:t xml:space="preserve">Every time something happened to his ticket, Jordan was notified automatically: the status changes, the reply and the new file. And notice — there is no notification about the internal note; Jordan is not even told it exists.</w:t>
       </w:r>
     </w:p>
     <w:p>
@@ -1920,7 +2319,7 @@
           <w:rFonts w:ascii="Calibri" w:hAnsi="Calibri"/>
           <w:sz w:val="22"/>
         </w:rPr>
-        <w:t xml:space="preserve">Click the top notification "Status: INC-2026-000.. is Resolved". Scroll to Conversation.</w:t>
+        <w:t xml:space="preserve">Click the notification "Status: INC-2026-000.. is Resolved". Scroll to Conversation.</w:t>
       </w:r>
     </w:p>
     <w:p>
@@ -1997,22 +2396,82 @@
           <w:rFonts w:ascii="Calibri" w:hAnsi="Calibri"/>
           <w:sz w:val="22"/>
         </w:rPr>
-        <w:t xml:space="preserve"> → confirm. Status becomes Closed; the workflow bar shows all five steps done. Show </w:t>
-      </w:r>
-      <w:r>
-        <w:rPr>
-          <w:rFonts w:ascii="Calibri" w:hAnsi="Calibri"/>
-          <w:sz w:val="22"/>
-          <w:b/>
-        </w:rPr>
-        <w:t xml:space="preserve">Activity history</w:t>
-      </w:r>
-      <w:r>
-        <w:rPr>
-          <w:rFonts w:ascii="Calibri" w:hAnsi="Calibri"/>
-          <w:sz w:val="22"/>
-        </w:rPr>
-        <w:t xml:space="preserve"> on the right.</w:t>
+        <w:t xml:space="preserve"> → confirm. Status becomes Closed; the workflow bar shows all five steps done.</w:t>
+      </w:r>
+    </w:p>
+    <w:p>
+      <w:pPr>
+        <w:ind w:left="360"/>
+        <w:spacing w:after="60"/>
+      </w:pPr>
+      <w:r>
+        <w:rPr>
+          <w:rFonts w:ascii="Calibri" w:hAnsi="Calibri"/>
+          <w:color w:val="0E7490"/>
+          <w:sz w:val="22"/>
+          <w:b/>
+        </w:rPr>
+        <w:t xml:space="preserve">DO:</w:t>
+      </w:r>
+      <w:r>
+        <w:rPr>
+          <w:rFonts w:ascii="Calibri" w:hAnsi="Calibri"/>
+          <w:color w:val="0E7490"/>
+          <w:sz w:val="22"/>
+        </w:rPr>
+        <w:t xml:space="preserve">  </w:t>
+      </w:r>
+      <w:r>
+        <w:rPr>
+          <w:rFonts w:ascii="Calibri" w:hAnsi="Calibri"/>
+          <w:sz w:val="22"/>
+        </w:rPr>
+        <w:t xml:space="preserve">The card "</w:t>
+      </w:r>
+      <w:r>
+        <w:rPr>
+          <w:rFonts w:ascii="Calibri" w:hAnsi="Calibri"/>
+          <w:sz w:val="22"/>
+          <w:b/>
+        </w:rPr>
+        <w:t xml:space="preserve">How was the support you received?</w:t>
+      </w:r>
+      <w:r>
+        <w:rPr>
+          <w:rFonts w:ascii="Calibri" w:hAnsi="Calibri"/>
+          <w:sz w:val="22"/>
+        </w:rPr>
+        <w:t xml:space="preserve">" appears → click </w:t>
+      </w:r>
+      <w:r>
+        <w:rPr>
+          <w:rFonts w:ascii="Calibri" w:hAnsi="Calibri"/>
+          <w:sz w:val="22"/>
+          <w:b/>
+        </w:rPr>
+        <w:t xml:space="preserve">5 stars</w:t>
+      </w:r>
+      <w:r>
+        <w:rPr>
+          <w:rFonts w:ascii="Calibri" w:hAnsi="Calibri"/>
+          <w:sz w:val="22"/>
+        </w:rPr>
+        <w:t xml:space="preserve"> → comment "Quick fix, thank you" → </w:t>
+      </w:r>
+      <w:r>
+        <w:rPr>
+          <w:rFonts w:ascii="Calibri" w:hAnsi="Calibri"/>
+          <w:sz w:val="22"/>
+          <w:b/>
+        </w:rPr>
+        <w:t xml:space="preserve">Submit rating</w:t>
+      </w:r>
+      <w:r>
+        <w:rPr>
+          <w:rFonts w:ascii="Calibri" w:hAnsi="Calibri"/>
+          <w:sz w:val="22"/>
+        </w:rPr>
+        <w:t xml:space="preserve">.</w:t>
       </w:r>
     </w:p>
     <w:p>
@@ -2044,7 +2503,84 @@
           <w:i/>
           <w:sz w:val="22"/>
         </w:rPr>
-        <w:t xml:space="preserve">That is the complete lifecycle: reported, claimed, worked on, resolved within SLA, and confirmed by the employee. If the problem came back he could press Reopen within 14 days. The activity history shows who did what and when.</w:t>
+        <w:t xml:space="preserve">After closing, Jordan rates the support from 1 to 5 stars, once. Sarah gets a notification and the admin sees the average rating in Analytics.</w:t>
+      </w:r>
+    </w:p>
+    <w:p>
+      <w:pPr>
+        <w:ind w:left="360"/>
+        <w:spacing w:after="60"/>
+      </w:pPr>
+      <w:r>
+        <w:rPr>
+          <w:rFonts w:ascii="Calibri" w:hAnsi="Calibri"/>
+          <w:color w:val="0E7490"/>
+          <w:sz w:val="22"/>
+          <w:b/>
+        </w:rPr>
+        <w:t xml:space="preserve">DO:</w:t>
+      </w:r>
+      <w:r>
+        <w:rPr>
+          <w:rFonts w:ascii="Calibri" w:hAnsi="Calibri"/>
+          <w:color w:val="0E7490"/>
+          <w:sz w:val="22"/>
+        </w:rPr>
+        <w:t xml:space="preserve">  </w:t>
+      </w:r>
+      <w:r>
+        <w:rPr>
+          <w:rFonts w:ascii="Calibri" w:hAnsi="Calibri"/>
+          <w:sz w:val="22"/>
+        </w:rPr>
+        <w:t xml:space="preserve">Show </w:t>
+      </w:r>
+      <w:r>
+        <w:rPr>
+          <w:rFonts w:ascii="Calibri" w:hAnsi="Calibri"/>
+          <w:sz w:val="22"/>
+          <w:b/>
+        </w:rPr>
+        <w:t xml:space="preserve">Activity history</w:t>
+      </w:r>
+      <w:r>
+        <w:rPr>
+          <w:rFonts w:ascii="Calibri" w:hAnsi="Calibri"/>
+          <w:sz w:val="22"/>
+        </w:rPr>
+        <w:t xml:space="preserve"> on the right.</w:t>
+      </w:r>
+    </w:p>
+    <w:p>
+      <w:pPr>
+        <w:ind w:left="360"/>
+        <w:shd w:val="clear" w:color="auto" w:fill="FFF7E6"/>
+        <w:spacing w:after="120"/>
+      </w:pPr>
+      <w:r>
+        <w:rPr>
+          <w:rFonts w:ascii="Calibri" w:hAnsi="Calibri"/>
+          <w:color w:val="B45309"/>
+          <w:sz w:val="22"/>
+          <w:b/>
+        </w:rPr>
+        <w:t xml:space="preserve">SAY:</w:t>
+      </w:r>
+      <w:r>
+        <w:rPr>
+          <w:rFonts w:ascii="Calibri" w:hAnsi="Calibri"/>
+          <w:color w:val="B45309"/>
+          <w:sz w:val="22"/>
+        </w:rPr>
+        <w:t xml:space="preserve">  </w:t>
+      </w:r>
+      <w:r>
+        <w:rPr>
+          <w:rFonts w:ascii="Calibri" w:hAnsi="Calibri"/>
+          <w:i/>
+          <w:sz w:val="22"/>
+        </w:rPr>
+        <w:t xml:space="preserve">That is the complete lifecycle: reported, assigned automatically, worked on, resolved within SLA, confirmed and rated by the employee. If the problem came back he could press Reopen within 14 days. The activity history shows who did what and when.</w:t>
       </w:r>
     </w:p>
     <w:p>
@@ -2184,7 +2720,7 @@
           <w:rFonts w:ascii="Calibri" w:hAnsi="Calibri"/>
           <w:sz w:val="22"/>
         </w:rPr>
-        <w:t xml:space="preserve">Scroll down: ticket trend, priority and status charts, categories, technician workload, overdue incidents, recent audit events.</w:t>
+        <w:t xml:space="preserve">Scroll down: ticket trend, priority and status charts, categories, technician workload (with each technician's rating), overdue incidents, recent audit events.</w:t>
       </w:r>
     </w:p>
     <w:p>
@@ -2261,7 +2797,22 @@
           <w:rFonts w:ascii="Calibri" w:hAnsi="Calibri"/>
           <w:sz w:val="22"/>
         </w:rPr>
-        <w:t xml:space="preserve"> → click 7 days, then 90 days.</w:t>
+        <w:t xml:space="preserve"> → click 7 days, then 90 days. Point at </w:t>
+      </w:r>
+      <w:r>
+        <w:rPr>
+          <w:rFonts w:ascii="Calibri" w:hAnsi="Calibri"/>
+          <w:sz w:val="22"/>
+          <w:b/>
+        </w:rPr>
+        <w:t xml:space="preserve">Customer satisfaction</w:t>
+      </w:r>
+      <w:r>
+        <w:rPr>
+          <w:rFonts w:ascii="Calibri" w:hAnsi="Calibri"/>
+          <w:sz w:val="22"/>
+        </w:rPr>
+        <w:t xml:space="preserve"> and the ratings chart.</w:t>
       </w:r>
     </w:p>
     <w:p>
@@ -2293,7 +2844,7 @@
           <w:i/>
           <w:sz w:val="22"/>
         </w:rPr>
-        <w:t xml:space="preserve">Analytics gives reports over different periods: created versus resolved, average fixing time per priority, technician performance.</w:t>
+        <w:t xml:space="preserve">Analytics gives reports over different periods: created versus resolved, average fixing time per priority, technician performance and customer ratings.</w:t>
       </w:r>
     </w:p>
     <w:p>
@@ -2308,7 +2859,7 @@
           <w:color w:val="0E7490"/>
           <w:sz w:val="25"/>
         </w:rPr>
-        <w:t xml:space="preserve">Part B — Change an SLA deadline</w:t>
+        <w:t xml:space="preserve">Part B — Auto-assignment (no work for the admin)</w:t>
       </w:r>
     </w:p>
     <w:p>
@@ -2346,14 +2897,29 @@
           <w:sz w:val="22"/>
           <w:b/>
         </w:rPr>
-        <w:t xml:space="preserve">SLA Policies</w:t>
-      </w:r>
-      <w:r>
-        <w:rPr>
-          <w:rFonts w:ascii="Calibri" w:hAnsi="Calibri"/>
-          <w:sz w:val="22"/>
-        </w:rPr>
-        <w:t xml:space="preserve"> → pencil ✎ on the High row → Resolution Target 12 → </w:t>
+        <w:t xml:space="preserve">Auto-Assignment</w:t>
+      </w:r>
+      <w:r>
+        <w:rPr>
+          <w:rFonts w:ascii="Calibri" w:hAnsi="Calibri"/>
+          <w:sz w:val="22"/>
+        </w:rPr>
+        <w:t xml:space="preserve">. Show: </w:t>
+      </w:r>
+      <w:r>
+        <w:rPr>
+          <w:rFonts w:ascii="Calibri" w:hAnsi="Calibri"/>
+          <w:sz w:val="22"/>
+          <w:b/>
+        </w:rPr>
+        <w:t xml:space="preserve">ON</w:t>
+      </w:r>
+      <w:r>
+        <w:rPr>
+          <w:rFonts w:ascii="Calibri" w:hAnsi="Calibri"/>
+          <w:sz w:val="22"/>
+        </w:rPr>
+        <w:t xml:space="preserve">, maximum </w:t>
       </w:r>
       <w:r>
         <w:rPr>
@@ -2368,22 +2934,7 @@
           <w:rFonts w:ascii="Calibri" w:hAnsi="Calibri"/>
           <w:sz w:val="22"/>
         </w:rPr>
-        <w:t xml:space="preserve"> → tick "Recalculate deadlines of active tickets" → </w:t>
-      </w:r>
-      <w:r>
-        <w:rPr>
-          <w:rFonts w:ascii="Calibri" w:hAnsi="Calibri"/>
-          <w:sz w:val="22"/>
-          <w:b/>
-        </w:rPr>
-        <w:t xml:space="preserve">Save Policy</w:t>
-      </w:r>
-      <w:r>
-        <w:rPr>
-          <w:rFonts w:ascii="Calibri" w:hAnsi="Calibri"/>
-          <w:sz w:val="22"/>
-        </w:rPr>
-        <w:t xml:space="preserve">.</w:t>
+        <w:t xml:space="preserve"> open tickets per technician, the wait times, the technicians with their skills and workload points, and the tickets waiting in the queue.</w:t>
       </w:r>
     </w:p>
     <w:p>
@@ -2415,7 +2966,7 @@
           <w:i/>
           <w:sz w:val="22"/>
         </w:rPr>
-        <w:t xml:space="preserve">The admin can change the deadline for each priority, and the open High tickets were recalculated. The form does not allow a resolution time shorter than the response time.</w:t>
+        <w:t xml:space="preserve">Ma'am, the admin does not have to assign tickets — the system does it on its own. The admin can change the maximum between 1 and 50 or switch it off, and gets an alert only when nobody can take a ticket, for example when everyone is away.</w:t>
       </w:r>
     </w:p>
     <w:p>
@@ -2430,7 +2981,7 @@
           <w:color w:val="0E7490"/>
           <w:sz w:val="25"/>
         </w:rPr>
-        <w:t xml:space="preserve">Part C — Create a user</w:t>
+        <w:t xml:space="preserve">Part C — Change an SLA deadline</w:t>
       </w:r>
     </w:p>
     <w:p>
@@ -2468,37 +3019,37 @@
           <w:sz w:val="22"/>
           <w:b/>
         </w:rPr>
-        <w:t xml:space="preserve">Users &amp; Roles</w:t>
-      </w:r>
-      <w:r>
-        <w:rPr>
-          <w:rFonts w:ascii="Calibri" w:hAnsi="Calibri"/>
-          <w:sz w:val="22"/>
-        </w:rPr>
-        <w:t xml:space="preserve"> → </w:t>
-      </w:r>
-      <w:r>
-        <w:rPr>
-          <w:rFonts w:ascii="Calibri" w:hAnsi="Calibri"/>
-          <w:sz w:val="22"/>
-          <w:b/>
-        </w:rPr>
-        <w:t xml:space="preserve">Add User</w:t>
-      </w:r>
-      <w:r>
-        <w:rPr>
-          <w:rFonts w:ascii="Calibri" w:hAnsi="Calibri"/>
-          <w:sz w:val="22"/>
-        </w:rPr>
-        <w:t xml:space="preserve">: Full Name Ravi Kumar, Username ravi.tech, Role Support Technician, Email ravi.tech@cloudops360.local, Password Support2026A → </w:t>
-      </w:r>
-      <w:r>
-        <w:rPr>
-          <w:rFonts w:ascii="Calibri" w:hAnsi="Calibri"/>
-          <w:sz w:val="22"/>
-          <w:b/>
-        </w:rPr>
-        <w:t xml:space="preserve">Create User</w:t>
+        <w:t xml:space="preserve">SLA Policies</w:t>
+      </w:r>
+      <w:r>
+        <w:rPr>
+          <w:rFonts w:ascii="Calibri" w:hAnsi="Calibri"/>
+          <w:sz w:val="22"/>
+        </w:rPr>
+        <w:t xml:space="preserve"> → pencil ✎ on the High row → Resolution Target 12 → </w:t>
+      </w:r>
+      <w:r>
+        <w:rPr>
+          <w:rFonts w:ascii="Calibri" w:hAnsi="Calibri"/>
+          <w:sz w:val="22"/>
+          <w:b/>
+        </w:rPr>
+        <w:t xml:space="preserve">10</w:t>
+      </w:r>
+      <w:r>
+        <w:rPr>
+          <w:rFonts w:ascii="Calibri" w:hAnsi="Calibri"/>
+          <w:sz w:val="22"/>
+        </w:rPr>
+        <w:t xml:space="preserve"> → tick "Recalculate deadlines of active tickets" → </w:t>
+      </w:r>
+      <w:r>
+        <w:rPr>
+          <w:rFonts w:ascii="Calibri" w:hAnsi="Calibri"/>
+          <w:sz w:val="22"/>
+          <w:b/>
+        </w:rPr>
+        <w:t xml:space="preserve">Save Policy</w:t>
       </w:r>
       <w:r>
         <w:rPr>
@@ -2537,7 +3088,7 @@
           <w:i/>
           <w:sz w:val="22"/>
         </w:rPr>
-        <w:t xml:space="preserve">Only the admin can create technicians or admins; self-registered users are always employees. Passwords need 10+ characters with upper, lower case and a number, and are stored as secure hashes. The admin cannot remove their own admin role, so the system always keeps an administrator.</w:t>
+        <w:t xml:space="preserve">The admin can change the deadline for each priority, and the open High tickets were recalculated. The form does not allow a resolution time shorter than the response time.</w:t>
       </w:r>
     </w:p>
     <w:p>
@@ -2552,7 +3103,7 @@
           <w:color w:val="0E7490"/>
           <w:sz w:val="25"/>
         </w:rPr>
-        <w:t xml:space="preserve">Part D — Audit trail</w:t>
+        <w:t xml:space="preserve">Part D — Create a user</w:t>
       </w:r>
     </w:p>
     <w:p>
@@ -2590,29 +3141,44 @@
           <w:sz w:val="22"/>
           <w:b/>
         </w:rPr>
-        <w:t xml:space="preserve">Audit Trail</w:t>
-      </w:r>
-      <w:r>
-        <w:rPr>
-          <w:rFonts w:ascii="Calibri" w:hAnsi="Calibri"/>
-          <w:sz w:val="22"/>
-        </w:rPr>
-        <w:t xml:space="preserve"> → Event type: </w:t>
-      </w:r>
-      <w:r>
-        <w:rPr>
-          <w:rFonts w:ascii="Calibri" w:hAnsi="Calibri"/>
-          <w:sz w:val="22"/>
-          <w:b/>
-        </w:rPr>
-        <w:t xml:space="preserve">TICKET_UNAUTHORIZED_ACCESS</w:t>
-      </w:r>
-      <w:r>
-        <w:rPr>
-          <w:rFonts w:ascii="Calibri" w:hAnsi="Calibri"/>
-          <w:sz w:val="22"/>
-        </w:rPr>
-        <w:t xml:space="preserve"> → point at emp_jordan / INC-2026-00002.</w:t>
+        <w:t xml:space="preserve">Users &amp; Roles</w:t>
+      </w:r>
+      <w:r>
+        <w:rPr>
+          <w:rFonts w:ascii="Calibri" w:hAnsi="Calibri"/>
+          <w:sz w:val="22"/>
+        </w:rPr>
+        <w:t xml:space="preserve"> → </w:t>
+      </w:r>
+      <w:r>
+        <w:rPr>
+          <w:rFonts w:ascii="Calibri" w:hAnsi="Calibri"/>
+          <w:sz w:val="22"/>
+          <w:b/>
+        </w:rPr>
+        <w:t xml:space="preserve">Add User</w:t>
+      </w:r>
+      <w:r>
+        <w:rPr>
+          <w:rFonts w:ascii="Calibri" w:hAnsi="Calibri"/>
+          <w:sz w:val="22"/>
+        </w:rPr>
+        <w:t xml:space="preserve">: Full Name Ravi Kumar, Username ravi.tech, Role Support Technician, Email ravi.tech@cloudops360.local, Password Support2026A → </w:t>
+      </w:r>
+      <w:r>
+        <w:rPr>
+          <w:rFonts w:ascii="Calibri" w:hAnsi="Calibri"/>
+          <w:sz w:val="22"/>
+          <w:b/>
+        </w:rPr>
+        <w:t xml:space="preserve">Create User</w:t>
+      </w:r>
+      <w:r>
+        <w:rPr>
+          <w:rFonts w:ascii="Calibri" w:hAnsi="Calibri"/>
+          <w:sz w:val="22"/>
+        </w:rPr>
+        <w:t xml:space="preserve">.</w:t>
       </w:r>
     </w:p>
     <w:p>
@@ -2644,7 +3210,22 @@
           <w:i/>
           <w:sz w:val="22"/>
         </w:rPr>
-        <w:t xml:space="preserve">This is the security log. Here is Jordan's attempt to open Elena's ticket, with time and IP address.</w:t>
+        <w:t xml:space="preserve">Only the admin can create technicians or admins; self-registered users are always employees. Passwords need 10+ characters with upper, lower case and a number, and are stored as secure hashes. The admin cannot remove their own admin role, so the system always keeps an administrator. On a technician's edit page the admin also sets their skills.</w:t>
+      </w:r>
+    </w:p>
+    <w:p>
+      <w:pPr>
+        <w:keepNext/>
+        <w:spacing w:before="180" w:after="60"/>
+      </w:pPr>
+      <w:r>
+        <w:rPr>
+          <w:rFonts w:ascii="Calibri" w:hAnsi="Calibri"/>
+          <w:b/>
+          <w:color w:val="0E7490"/>
+          <w:sz w:val="25"/>
+        </w:rPr>
+        <w:t xml:space="preserve">Part E — Audit trail</w:t>
       </w:r>
     </w:p>
     <w:p>
@@ -2674,37 +3255,37 @@
           <w:rFonts w:ascii="Calibri" w:hAnsi="Calibri"/>
           <w:sz w:val="22"/>
         </w:rPr>
-        <w:t xml:space="preserve">Event type: </w:t>
-      </w:r>
-      <w:r>
-        <w:rPr>
-          <w:rFonts w:ascii="Calibri" w:hAnsi="Calibri"/>
-          <w:sz w:val="22"/>
-          <w:b/>
-        </w:rPr>
-        <w:t xml:space="preserve">ACCESS_DENIED_RBAC</w:t>
-      </w:r>
-      <w:r>
-        <w:rPr>
-          <w:rFonts w:ascii="Calibri" w:hAnsi="Calibri"/>
-          <w:sz w:val="22"/>
-        </w:rPr>
-        <w:t xml:space="preserve"> (Jordan trying /admin/users). Then </w:t>
-      </w:r>
-      <w:r>
-        <w:rPr>
-          <w:rFonts w:ascii="Calibri" w:hAnsi="Calibri"/>
-          <w:sz w:val="22"/>
-          <w:b/>
-        </w:rPr>
-        <w:t xml:space="preserve">Clear</w:t>
-      </w:r>
-      <w:r>
-        <w:rPr>
-          <w:rFonts w:ascii="Calibri" w:hAnsi="Calibri"/>
-          <w:sz w:val="22"/>
-        </w:rPr>
-        <w:t xml:space="preserve"> and show ADMIN_SLA_UPDATE and ADMIN_USER_CREATE at the top.</w:t>
+        <w:t xml:space="preserve">Sidebar → </w:t>
+      </w:r>
+      <w:r>
+        <w:rPr>
+          <w:rFonts w:ascii="Calibri" w:hAnsi="Calibri"/>
+          <w:sz w:val="22"/>
+          <w:b/>
+        </w:rPr>
+        <w:t xml:space="preserve">Audit Trail</w:t>
+      </w:r>
+      <w:r>
+        <w:rPr>
+          <w:rFonts w:ascii="Calibri" w:hAnsi="Calibri"/>
+          <w:sz w:val="22"/>
+        </w:rPr>
+        <w:t xml:space="preserve"> → Event type: </w:t>
+      </w:r>
+      <w:r>
+        <w:rPr>
+          <w:rFonts w:ascii="Calibri" w:hAnsi="Calibri"/>
+          <w:sz w:val="22"/>
+          <w:b/>
+        </w:rPr>
+        <w:t xml:space="preserve">TICKET_UNAUTHORIZED_ACCESS</w:t>
+      </w:r>
+      <w:r>
+        <w:rPr>
+          <w:rFonts w:ascii="Calibri" w:hAnsi="Calibri"/>
+          <w:sz w:val="22"/>
+        </w:rPr>
+        <w:t xml:space="preserve"> → point at emp_jordan / INC-2026-00002.</w:t>
       </w:r>
     </w:p>
     <w:p>
@@ -2736,7 +3317,129 @@
           <w:i/>
           <w:sz w:val="22"/>
         </w:rPr>
-        <w:t xml:space="preserve">Every important action is logged: logins, failed logins, blocked access, role changes, status changes, SLA changes and new users. Passwords are never written to the log.</w:t>
+        <w:t xml:space="preserve">This is the security log. Here is Jordan's attempt to open Elena's ticket, with time and IP address.</w:t>
+      </w:r>
+    </w:p>
+    <w:p>
+      <w:pPr>
+        <w:ind w:left="360"/>
+        <w:spacing w:after="60"/>
+      </w:pPr>
+      <w:r>
+        <w:rPr>
+          <w:rFonts w:ascii="Calibri" w:hAnsi="Calibri"/>
+          <w:color w:val="0E7490"/>
+          <w:sz w:val="22"/>
+          <w:b/>
+        </w:rPr>
+        <w:t xml:space="preserve">DO:</w:t>
+      </w:r>
+      <w:r>
+        <w:rPr>
+          <w:rFonts w:ascii="Calibri" w:hAnsi="Calibri"/>
+          <w:color w:val="0E7490"/>
+          <w:sz w:val="22"/>
+        </w:rPr>
+        <w:t xml:space="preserve">  </w:t>
+      </w:r>
+      <w:r>
+        <w:rPr>
+          <w:rFonts w:ascii="Calibri" w:hAnsi="Calibri"/>
+          <w:sz w:val="22"/>
+        </w:rPr>
+        <w:t xml:space="preserve">Event type: </w:t>
+      </w:r>
+      <w:r>
+        <w:rPr>
+          <w:rFonts w:ascii="Calibri" w:hAnsi="Calibri"/>
+          <w:sz w:val="22"/>
+          <w:b/>
+        </w:rPr>
+        <w:t xml:space="preserve">ACCESS_DENIED_RBAC</w:t>
+      </w:r>
+      <w:r>
+        <w:rPr>
+          <w:rFonts w:ascii="Calibri" w:hAnsi="Calibri"/>
+          <w:sz w:val="22"/>
+        </w:rPr>
+        <w:t xml:space="preserve"> (Jordan trying /admin/users). Then </w:t>
+      </w:r>
+      <w:r>
+        <w:rPr>
+          <w:rFonts w:ascii="Calibri" w:hAnsi="Calibri"/>
+          <w:sz w:val="22"/>
+          <w:b/>
+        </w:rPr>
+        <w:t xml:space="preserve">TICKET_AUTO_ASSIGN</w:t>
+      </w:r>
+      <w:r>
+        <w:rPr>
+          <w:rFonts w:ascii="Calibri" w:hAnsi="Calibri"/>
+          <w:sz w:val="22"/>
+        </w:rPr>
+        <w:t xml:space="preserve"> (done by the system, no user) and </w:t>
+      </w:r>
+      <w:r>
+        <w:rPr>
+          <w:rFonts w:ascii="Calibri" w:hAnsi="Calibri"/>
+          <w:sz w:val="22"/>
+          <w:b/>
+        </w:rPr>
+        <w:t xml:space="preserve">TICKET_RATED</w:t>
+      </w:r>
+      <w:r>
+        <w:rPr>
+          <w:rFonts w:ascii="Calibri" w:hAnsi="Calibri"/>
+          <w:sz w:val="22"/>
+        </w:rPr>
+        <w:t xml:space="preserve">. Then </w:t>
+      </w:r>
+      <w:r>
+        <w:rPr>
+          <w:rFonts w:ascii="Calibri" w:hAnsi="Calibri"/>
+          <w:sz w:val="22"/>
+          <w:b/>
+        </w:rPr>
+        <w:t xml:space="preserve">Clear</w:t>
+      </w:r>
+      <w:r>
+        <w:rPr>
+          <w:rFonts w:ascii="Calibri" w:hAnsi="Calibri"/>
+          <w:sz w:val="22"/>
+        </w:rPr>
+        <w:t xml:space="preserve"> and show ADMIN_SLA_UPDATE and ADMIN_USER_CREATE at the top.</w:t>
+      </w:r>
+    </w:p>
+    <w:p>
+      <w:pPr>
+        <w:ind w:left="360"/>
+        <w:shd w:val="clear" w:color="auto" w:fill="FFF7E6"/>
+        <w:spacing w:after="120"/>
+      </w:pPr>
+      <w:r>
+        <w:rPr>
+          <w:rFonts w:ascii="Calibri" w:hAnsi="Calibri"/>
+          <w:color w:val="B45309"/>
+          <w:sz w:val="22"/>
+          <w:b/>
+        </w:rPr>
+        <w:t xml:space="preserve">SAY:</w:t>
+      </w:r>
+      <w:r>
+        <w:rPr>
+          <w:rFonts w:ascii="Calibri" w:hAnsi="Calibri"/>
+          <w:color w:val="B45309"/>
+          <w:sz w:val="22"/>
+        </w:rPr>
+        <w:t xml:space="preserve">  </w:t>
+      </w:r>
+      <w:r>
+        <w:rPr>
+          <w:rFonts w:ascii="Calibri" w:hAnsi="Calibri"/>
+          <w:i/>
+          <w:sz w:val="22"/>
+        </w:rPr>
+        <w:t xml:space="preserve">Every important action is logged: logins, failed logins, blocked access, role changes, status changes, automatic assignments, ratings, SLA changes and new users. Passwords are never written to the log.</w:t>
       </w:r>
     </w:p>
     <w:p>
@@ -2986,7 +3689,7 @@
           <w:color w:val="0F172A"/>
           <w:sz w:val="30"/>
         </w:rPr>
-        <w:t xml:space="preserve">Step 8 — Proof it is tested (1 min)</w:t>
+        <w:t xml:space="preserve">Step 8 — Proof it is tested (1 min, on the laptop)</w:t>
       </w:r>
     </w:p>
     <w:p>
@@ -3000,21 +3703,7 @@
           <w:rFonts w:ascii="Consolas" w:hAnsi="Consolas"/>
           <w:sz w:val="20"/>
         </w:rPr>
-        <w:t xml:space="preserve">Laptop:      .venv\Scripts\python -m pytest -q</w:t>
-      </w:r>
-    </w:p>
-    <w:p>
-      <w:pPr>
-        <w:shd w:val="clear" w:color="auto" w:fill="EEF2F6"/>
-        <w:ind w:left="360"/>
-        <w:spacing w:after="60"/>
-      </w:pPr>
-      <w:r>
-        <w:rPr>
-          <w:rFonts w:ascii="Consolas" w:hAnsi="Consolas"/>
-          <w:sz w:val="20"/>
-        </w:rPr>
-        <w:t xml:space="preserve">Codespaces:  python -m pytest -q</w:t>
+        <w:t xml:space="preserve">.venv\Scripts\python -m pytest -q</w:t>
       </w:r>
     </w:p>
     <w:p>
@@ -3034,7 +3723,7 @@
           <w:sz w:val="22"/>
           <w:b/>
         </w:rPr>
-        <w:t xml:space="preserve">123 passed</w:t>
+        <w:t xml:space="preserve">144 passed</w:t>
       </w:r>
       <w:r>
         <w:rPr>
@@ -3073,7 +3762,7 @@
           <w:i/>
           <w:sz w:val="22"/>
         </w:rPr>
-        <w:t xml:space="preserve">I wrote 123 automated tests for login, permissions, the workflow, internal-note privacy, file uploads, SLA calculations and dashboards. All pass, on both SQLite and MySQL.</w:t>
+        <w:t xml:space="preserve">I wrote 144 automated tests for login, permissions, the workflow, internal-note privacy, file uploads, SLA calculations, dashboards, auto-assignment and ratings. All pass, on both SQLite and MySQL.</w:t>
       </w:r>
     </w:p>
     <w:p>
@@ -3123,7 +3812,7 @@
           <w:i/>
           <w:sz w:val="22"/>
         </w:rPr>
-        <w:t xml:space="preserve">To summarize: CloudOps 360 is a complete IT helpdesk with three roles, a controlled ticket workflow, SLA tracking, notifications and an audit log, with security built in. In Lab 1 I will deploy it on an EC2 server with Nginx and Gunicorn, in Lab 2 move the database to RDS and the files to EFS, and in Lab 3 add IAM roles, Secrets Manager, HTTPS and encryption. The deployment scripts and guides are already in the project. Thank you, ma'am.</w:t>
+        <w:t xml:space="preserve">To summarize: CloudOps 360 is a complete IT helpdesk with three roles, a controlled ticket workflow, automatic assignment, SLA tracking, notifications, star ratings and an audit log, with security built in. Lab 1 is done: it runs on an EC2 server with Nginx, Gunicorn and MariaDB, installed automatically by a User data script. In Lab 2 we move the database to RDS and the files to EFS, and in Lab 3 we add IAM roles, Secrets Manager, HTTPS and encryption. The scripts and guides are already in the project. Thank you, ma'am.</w:t>
       </w:r>
     </w:p>
     <w:p>
@@ -3190,14 +3879,14 @@
           <w:sz w:val="22"/>
           <w:b/>
         </w:rPr>
-        <w:t xml:space="preserve">Where is the data?</w:t>
-      </w:r>
-      <w:r>
-        <w:rPr>
-          <w:rFonts w:ascii="Calibri" w:hAnsi="Calibri"/>
-          <w:sz w:val="22"/>
-        </w:rPr>
-        <w:t xml:space="preserve"> In MySQL tables: users, tickets, comments, attachments, status history, audit logs, notifications, SLA policies, categories, login attempts.</w:t>
+        <w:t xml:space="preserve">How does auto-assignment choose?</w:t>
+      </w:r>
+      <w:r>
+        <w:rPr>
+          <w:rFonts w:ascii="Calibri" w:hAnsi="Calibri"/>
+          <w:sz w:val="22"/>
+        </w:rPr>
+        <w:t xml:space="preserve"> Only technicians who are Available and below the maximum (10). Specialists for the ticket's category first, then the lightest workload — Critical counts 4 points, High 3, Medium 2, Low 1. If everyone is free, the ticket waits for someone to claim it, and is assigned automatically after a wait time.</w:t>
       </w:r>
     </w:p>
     <w:p>
@@ -3218,14 +3907,14 @@
           <w:sz w:val="22"/>
           <w:b/>
         </w:rPr>
-        <w:t xml:space="preserve">How are passwords stored?</w:t>
-      </w:r>
-      <w:r>
-        <w:rPr>
-          <w:rFonts w:ascii="Calibri" w:hAnsi="Calibri"/>
-          <w:sz w:val="22"/>
-        </w:rPr>
-        <w:t xml:space="preserve"> As one-way hashes, never as plain text.</w:t>
+        <w:t xml:space="preserve">What if a technician is sick?</w:t>
+      </w:r>
+      <w:r>
+        <w:rPr>
+          <w:rFonts w:ascii="Calibri" w:hAnsi="Calibri"/>
+          <w:sz w:val="22"/>
+        </w:rPr>
+        <w:t xml:space="preserve"> They set themselves Away with a return date: no new tickets, no new-ticket notifications, available again automatically on that date; the admin is warned about their open tickets.</w:t>
       </w:r>
     </w:p>
     <w:p>
@@ -3246,14 +3935,14 @@
           <w:sz w:val="22"/>
           <w:b/>
         </w:rPr>
-        <w:t xml:space="preserve">Why can't the employee see the internal note?</w:t>
-      </w:r>
-      <w:r>
-        <w:rPr>
-          <w:rFonts w:ascii="Calibri" w:hAnsi="Calibri"/>
-          <w:sz w:val="22"/>
-        </w:rPr>
-        <w:t xml:space="preserve"> Each comment has an internal flag; for employees the database query skips those comments.</w:t>
+        <w:t xml:space="preserve">What is the star rating?</w:t>
+      </w:r>
+      <w:r>
+        <w:rPr>
+          <w:rFonts w:ascii="Calibri" w:hAnsi="Calibri"/>
+          <w:sz w:val="22"/>
+        </w:rPr>
+        <w:t xml:space="preserve"> Customer satisfaction (CSAT): after closing, the employee rates the support 1–5 stars once; the averages are in Analytics.</w:t>
       </w:r>
     </w:p>
     <w:p>
@@ -3274,14 +3963,14 @@
           <w:sz w:val="22"/>
           <w:b/>
         </w:rPr>
-        <w:t xml:space="preserve">How are files kept safe?</w:t>
-      </w:r>
-      <w:r>
-        <w:rPr>
-          <w:rFonts w:ascii="Calibri" w:hAnsi="Calibri"/>
-          <w:sz w:val="22"/>
-        </w:rPr>
-        <w:t xml:space="preserve"> Allowed types only, content checked, max 10 MB, random stored name, checksum, download only for people who can see the ticket.</w:t>
+        <w:t xml:space="preserve">What is IAM in your project?</w:t>
+      </w:r>
+      <w:r>
+        <w:rPr>
+          <w:rFonts w:ascii="Calibri" w:hAnsi="Calibri"/>
+          <w:sz w:val="22"/>
+        </w:rPr>
+        <w:t xml:space="preserve"> Inside the app every user has one role, the admin gives roles on Users &amp; Roles, and every request is checked on the server (403 + audit log) — the same idea as AWS IAM. For AWS we wrote a least-privilege IAM role policy; the Sandbox did not let us attach a role, so the database password is in a locked file only the app can read.</w:t>
       </w:r>
     </w:p>
     <w:p>
@@ -3302,6 +3991,118 @@
           <w:sz w:val="22"/>
           <w:b/>
         </w:rPr>
+        <w:t xml:space="preserve">Where is the data?</w:t>
+      </w:r>
+      <w:r>
+        <w:rPr>
+          <w:rFonts w:ascii="Calibri" w:hAnsi="Calibri"/>
+          <w:sz w:val="22"/>
+        </w:rPr>
+        <w:t xml:space="preserve"> In 12 MySQL tables: users, tickets, comments, attachments, status history, audit logs, notifications, SLA policies, categories, login attempts, technician skills, system settings.</w:t>
+      </w:r>
+    </w:p>
+    <w:p>
+      <w:pPr>
+        <w:ind w:left="540" w:hanging="220"/>
+        <w:spacing w:after="40"/>
+      </w:pPr>
+      <w:r>
+        <w:rPr>
+          <w:rFonts w:ascii="Calibri" w:hAnsi="Calibri"/>
+          <w:sz w:val="22"/>
+        </w:rPr>
+        <w:t xml:space="preserve">•  </w:t>
+      </w:r>
+      <w:r>
+        <w:rPr>
+          <w:rFonts w:ascii="Calibri" w:hAnsi="Calibri"/>
+          <w:sz w:val="22"/>
+          <w:b/>
+        </w:rPr>
+        <w:t xml:space="preserve">How are passwords stored?</w:t>
+      </w:r>
+      <w:r>
+        <w:rPr>
+          <w:rFonts w:ascii="Calibri" w:hAnsi="Calibri"/>
+          <w:sz w:val="22"/>
+        </w:rPr>
+        <w:t xml:space="preserve"> As one-way hashes, never as plain text.</w:t>
+      </w:r>
+    </w:p>
+    <w:p>
+      <w:pPr>
+        <w:ind w:left="540" w:hanging="220"/>
+        <w:spacing w:after="40"/>
+      </w:pPr>
+      <w:r>
+        <w:rPr>
+          <w:rFonts w:ascii="Calibri" w:hAnsi="Calibri"/>
+          <w:sz w:val="22"/>
+        </w:rPr>
+        <w:t xml:space="preserve">•  </w:t>
+      </w:r>
+      <w:r>
+        <w:rPr>
+          <w:rFonts w:ascii="Calibri" w:hAnsi="Calibri"/>
+          <w:sz w:val="22"/>
+          <w:b/>
+        </w:rPr>
+        <w:t xml:space="preserve">Why can't the employee see the internal note?</w:t>
+      </w:r>
+      <w:r>
+        <w:rPr>
+          <w:rFonts w:ascii="Calibri" w:hAnsi="Calibri"/>
+          <w:sz w:val="22"/>
+        </w:rPr>
+        <w:t xml:space="preserve"> Each comment has an internal flag; for employees the database query skips those comments.</w:t>
+      </w:r>
+    </w:p>
+    <w:p>
+      <w:pPr>
+        <w:ind w:left="540" w:hanging="220"/>
+        <w:spacing w:after="40"/>
+      </w:pPr>
+      <w:r>
+        <w:rPr>
+          <w:rFonts w:ascii="Calibri" w:hAnsi="Calibri"/>
+          <w:sz w:val="22"/>
+        </w:rPr>
+        <w:t xml:space="preserve">•  </w:t>
+      </w:r>
+      <w:r>
+        <w:rPr>
+          <w:rFonts w:ascii="Calibri" w:hAnsi="Calibri"/>
+          <w:sz w:val="22"/>
+          <w:b/>
+        </w:rPr>
+        <w:t xml:space="preserve">How are files kept safe?</w:t>
+      </w:r>
+      <w:r>
+        <w:rPr>
+          <w:rFonts w:ascii="Calibri" w:hAnsi="Calibri"/>
+          <w:sz w:val="22"/>
+        </w:rPr>
+        <w:t xml:space="preserve"> Allowed types only, content checked, max 10 MB, random stored name, checksum, download only for people who can see the ticket.</w:t>
+      </w:r>
+    </w:p>
+    <w:p>
+      <w:pPr>
+        <w:ind w:left="540" w:hanging="220"/>
+        <w:spacing w:after="40"/>
+      </w:pPr>
+      <w:r>
+        <w:rPr>
+          <w:rFonts w:ascii="Calibri" w:hAnsi="Calibri"/>
+          <w:sz w:val="22"/>
+        </w:rPr>
+        <w:t xml:space="preserve">•  </w:t>
+      </w:r>
+      <w:r>
+        <w:rPr>
+          <w:rFonts w:ascii="Calibri" w:hAnsi="Calibri"/>
+          <w:sz w:val="22"/>
+          <w:b/>
+        </w:rPr>
         <w:t xml:space="preserve">Is it on AWS now?</w:t>
       </w:r>
       <w:r>
@@ -3309,7 +4110,7 @@
           <w:rFonts w:ascii="Calibri" w:hAnsi="Calibri"/>
           <w:sz w:val="22"/>
         </w:rPr>
-        <w:t xml:space="preserve"> Not yet — it runs locally now; AWS deployment is the next three labs and the scripts are ready.</w:t>
+        <w:t xml:space="preserve"> Yes — Lab 1: an EC2 server (Amazon Linux 2023, t3.micro) with Nginx, Gunicorn and MariaDB. The 2-line User data installs everything from GitHub in about 10 minutes. Lab 2 and 3 are next.</w:t>
       </w:r>
     </w:p>
     <w:p>
@@ -3368,7 +4169,7 @@
           <w:rFonts w:ascii="Calibri" w:hAnsi="Calibri"/>
           <w:sz w:val="22"/>
         </w:rPr>
-        <w:t xml:space="preserve">•  Page will not open → run the start command again and keep that window open.</w:t>
+        <w:t xml:space="preserve">•  AWS site does not open → wait about 10 minutes after launch; use http:// (not https://); check the Sandbox timer.</w:t>
       </w:r>
     </w:p>
     <w:p>
@@ -3381,7 +4182,7 @@
           <w:rFonts w:ascii="Calibri" w:hAnsi="Calibri"/>
           <w:sz w:val="22"/>
         </w:rPr>
-        <w:t xml:space="preserve">•  "Address already in use" → the site is already running; just open the browser.</w:t>
+        <w:t xml:space="preserve">•  Sandbox expired ("You must first log out" / voc-cancel-cred) → log out, Start Lab again, launch a new instance with the User data.</w:t>
       </w:r>
     </w:p>
     <w:p>
@@ -3394,7 +4195,7 @@
           <w:rFonts w:ascii="Calibri" w:hAnsi="Calibri"/>
           <w:sz w:val="22"/>
         </w:rPr>
-        <w:t xml:space="preserve">•  "Can't connect to MySQL" → PowerShell as Administrator:  Start-Service MySQL80</w:t>
+        <w:t xml:space="preserve">•  AWS not working at all → use Option B on the laptop.</w:t>
       </w:r>
     </w:p>
     <w:p>
@@ -3407,7 +4208,7 @@
           <w:rFonts w:ascii="Calibri" w:hAnsi="Calibri"/>
           <w:sz w:val="22"/>
         </w:rPr>
-        <w:t xml:space="preserve">•  A real account got locked → .venv\Scripts\flask purge-login-attempts --days 0</w:t>
+        <w:t xml:space="preserve">•  Laptop page will not open → run the start command again and keep that window open.</w:t>
       </w:r>
     </w:p>
     <w:p>
@@ -3420,7 +4221,7 @@
           <w:rFonts w:ascii="Calibri" w:hAnsi="Calibri"/>
           <w:sz w:val="22"/>
         </w:rPr>
-        <w:t xml:space="preserve">•  Sent back to Sign In → session expired after 30 minutes idle; sign in again.</w:t>
+        <w:t xml:space="preserve">•  "Address already in use" → the site is already running; just open the browser.</w:t>
       </w:r>
     </w:p>
     <w:p>
@@ -3433,7 +4234,7 @@
           <w:rFonts w:ascii="Calibri" w:hAnsi="Calibri"/>
           <w:sz w:val="22"/>
         </w:rPr>
-        <w:t xml:space="preserve">•  404 Page Not Found when testing links → the address got doubled; use Ctrl + T and paste the full address.</w:t>
+        <w:t xml:space="preserve">•  "Can't connect to MySQL" → PowerShell as Administrator:  Start-Service MySQL80</w:t>
       </w:r>
     </w:p>
     <w:p>
@@ -3446,7 +4247,33 @@
           <w:rFonts w:ascii="Calibri" w:hAnsi="Calibri"/>
           <w:sz w:val="22"/>
         </w:rPr>
-        <w:t xml:space="preserve">•  Codespaces says "The database has no tables yet" → run: python -m flask db upgrade  then  python -m flask seed-db</w:t>
+        <w:t xml:space="preserve">•  A real account got locked → laptop: .venv\Scripts\flask purge-login-attempts --days 0</w:t>
+      </w:r>
+    </w:p>
+    <w:p>
+      <w:pPr>
+        <w:ind w:left="540" w:hanging="220"/>
+        <w:spacing w:after="40"/>
+      </w:pPr>
+      <w:r>
+        <w:rPr>
+          <w:rFonts w:ascii="Calibri" w:hAnsi="Calibri"/>
+          <w:sz w:val="22"/>
+        </w:rPr>
+        <w:t xml:space="preserve">•  Sent back to Sign In → session expired after 30 minutes idle; sign in again.</w:t>
+      </w:r>
+    </w:p>
+    <w:p>
+      <w:pPr>
+        <w:ind w:left="540" w:hanging="220"/>
+        <w:spacing w:after="40"/>
+      </w:pPr>
+      <w:r>
+        <w:rPr>
+          <w:rFonts w:ascii="Calibri" w:hAnsi="Calibri"/>
+          <w:sz w:val="22"/>
+        </w:rPr>
+        <w:t xml:space="preserve">•  404 Page Not Found when testing links → the address got doubled; use Ctrl + T and paste the full address.</w:t>
       </w:r>
     </w:p>
     <w:p>

</xml_diff>

<commit_message>
Add a demo reset with fresh ticket times for presentations
The demo data ages: after a few days every open sample ticket is
overdue and the queued ones have been auto-assigned. `flask reset-demo`
(refused in production) puts a demo database back to its starting
state: it deletes all tickets with their comments, history and
attachment files, notifications, audit entries, sign-in attempts and
settings, removes extra users and categories, resets the demo accounts,
skills and SLA targets, restarts ticket numbers at 00001 on MySQL and
creates the sample incidents again with times counted from now.
infrastructure/aws/reset_demo_data.sh runs it on the server.

The two newest open sample tickets are now 1 hour old, so after a reset
only the intentionally overdue ticket is overdue for at least 2 hours.

Co-Authored-By: Claude Opus 5.5 <noreply@anthropic.com>
</commit_message>
<xml_diff>
--- a/docs/CloudOps360_Demo_Script.docx
+++ b/docs/CloudOps360_Demo_Script.docx
@@ -55,7 +55,7 @@
           <w:rFonts w:ascii="Calibri" w:hAnsi="Calibri"/>
           <w:sz w:val="22"/>
         </w:rPr>
-        <w:t xml:space="preserve"> (what to speak). Say it in your own words. Total time: about 15 minutes. Demo files are in the folder CloudOps-360\demo_files. Updated 25 Oct 2026: the site is </w:t>
+        <w:t xml:space="preserve"> (what to speak). Say it in your own words. Total time: about 15 minutes. Demo files are in the folder CloudOps-360\demo_files. Updated 28 Oct 2026: the site is </w:t>
       </w:r>
       <w:r>
         <w:rPr>
@@ -254,6 +254,120 @@
     </w:p>
     <w:p>
       <w:pPr>
+        <w:ind w:left="540" w:hanging="300"/>
+        <w:spacing w:after="40"/>
+      </w:pPr>
+      <w:r>
+        <w:rPr>
+          <w:rFonts w:ascii="Calibri" w:hAnsi="Calibri"/>
+          <w:sz w:val="22"/>
+        </w:rPr>
+        <w:t xml:space="preserve">3.  </w:t>
+      </w:r>
+      <w:r>
+        <w:rPr>
+          <w:rFonts w:ascii="Calibri" w:hAnsi="Calibri"/>
+          <w:sz w:val="22"/>
+          <w:b/>
+        </w:rPr>
+        <w:t xml:space="preserve">About 30 minutes before you present</w:t>
+      </w:r>
+      <w:r>
+        <w:rPr>
+          <w:rFonts w:ascii="Calibri" w:hAnsi="Calibri"/>
+          <w:sz w:val="22"/>
+        </w:rPr>
+        <w:t xml:space="preserve">, reset the demo data: EC2 → cloudops360-web → </w:t>
+      </w:r>
+      <w:r>
+        <w:rPr>
+          <w:rFonts w:ascii="Calibri" w:hAnsi="Calibri"/>
+          <w:sz w:val="22"/>
+          <w:b/>
+        </w:rPr>
+        <w:t xml:space="preserve">Connect</w:t>
+      </w:r>
+      <w:r>
+        <w:rPr>
+          <w:rFonts w:ascii="Calibri" w:hAnsi="Calibri"/>
+          <w:sz w:val="22"/>
+        </w:rPr>
+        <w:t xml:space="preserve"> → </w:t>
+      </w:r>
+      <w:r>
+        <w:rPr>
+          <w:rFonts w:ascii="Calibri" w:hAnsi="Calibri"/>
+          <w:sz w:val="22"/>
+          <w:b/>
+        </w:rPr>
+        <w:t xml:space="preserve">EC2 Instance Connect</w:t>
+      </w:r>
+      <w:r>
+        <w:rPr>
+          <w:rFonts w:ascii="Calibri" w:hAnsi="Calibri"/>
+          <w:sz w:val="22"/>
+        </w:rPr>
+        <w:t xml:space="preserve"> → </w:t>
+      </w:r>
+      <w:r>
+        <w:rPr>
+          <w:rFonts w:ascii="Calibri" w:hAnsi="Calibri"/>
+          <w:sz w:val="22"/>
+          <w:b/>
+        </w:rPr>
+        <w:t xml:space="preserve">Connect</w:t>
+      </w:r>
+      <w:r>
+        <w:rPr>
+          <w:rFonts w:ascii="Calibri" w:hAnsi="Calibri"/>
+          <w:sz w:val="22"/>
+        </w:rPr>
+        <w:t xml:space="preserve"> → paste (right-click → Paste) and press Enter:</w:t>
+      </w:r>
+    </w:p>
+    <w:p>
+      <w:pPr>
+        <w:shd w:val="clear" w:color="auto" w:fill="EEF2F6"/>
+        <w:ind w:left="360"/>
+        <w:spacing w:after="60"/>
+      </w:pPr>
+      <w:r>
+        <w:rPr>
+          <w:rFonts w:ascii="Consolas" w:hAnsi="Consolas"/>
+          <w:sz w:val="20"/>
+        </w:rPr>
+        <w:t xml:space="preserve">sudo bash /opt/cloudops360/infrastructure/aws/reset_demo_data.sh</w:t>
+      </w:r>
+    </w:p>
+    <w:p>
+      <w:pPr>
+        <w:spacing w:after="100"/>
+      </w:pPr>
+      <w:r>
+        <w:rPr>
+          <w:rFonts w:ascii="Calibri" w:hAnsi="Calibri"/>
+          <w:sz w:val="22"/>
+        </w:rPr>
+        <w:t xml:space="preserve">It ends with </w:t>
+      </w:r>
+      <w:r>
+        <w:rPr>
+          <w:rFonts w:ascii="Calibri" w:hAnsi="Calibri"/>
+          <w:sz w:val="22"/>
+          <w:b/>
+        </w:rPr>
+        <w:t xml:space="preserve">[reset] Done</w:t>
+      </w:r>
+      <w:r>
+        <w:rPr>
+          <w:rFonts w:ascii="Calibri" w:hAnsi="Calibri"/>
+          <w:sz w:val="22"/>
+        </w:rPr>
+        <w:t xml:space="preserve">. The tickets get fresh times (only INC-2026-00005 is overdue, on purpose), and practice tickets, users and settings are removed. Run it only right before presenting.</w:t>
+      </w:r>
+    </w:p>
+    <w:p>
+      <w:pPr>
         <w:spacing w:after="100"/>
       </w:pPr>
       <w:r>
@@ -4841,7 +4955,7 @@
           <w:sz w:val="22"/>
           <w:b/>
         </w:rPr>
-        <w:t xml:space="preserve">145 passed</w:t>
+        <w:t xml:space="preserve">146 passed</w:t>
       </w:r>
       <w:r>
         <w:rPr>
@@ -4880,7 +4994,7 @@
           <w:i/>
           <w:sz w:val="22"/>
         </w:rPr>
-        <w:t xml:space="preserve">I wrote 145 automated tests for login, permissions, the workflow, internal-note privacy, file uploads, SLA calculations, dashboards, auto-assignment, leave requests and ratings. All pass, on both SQLite and MySQL.</w:t>
+        <w:t xml:space="preserve">I wrote 146 automated tests for login, permissions, the workflow, internal-note privacy, file uploads, SLA calculations, dashboards, auto-assignment, leave requests, ratings and the demo reset. All pass, on both SQLite and MySQL.</w:t>
       </w:r>
     </w:p>
     <w:p>

</xml_diff>